<commit_message>
update for basic info
</commit_message>
<xml_diff>
--- a/00_Master_Index/TAS2O_Complete_Package_Master_Index_AI_Enhanced.docx
+++ b/00_Master_Index/TAS2O_Complete_Package_Master_Index_AI_Enhanced.docx
@@ -30,17 +30,17 @@
     </w:p>
     <w:p>
       <w:r>
-        <w:t>Prepared for: [Insert School Name]</w:t>
+        <w:t>Prepared for: Webtree Academy</w:t>
       </w:r>
     </w:p>
     <w:p>
       <w:r>
-        <w:t>Prepared by: [Insert Name / Department]</w:t>
+        <w:t>Prepared by: Carlos Chen / Technological Education</w:t>
       </w:r>
     </w:p>
     <w:p>
       <w:r>
-        <w:t>Date: 2026-05-13</w:t>
+        <w:t>Date: 2026-05-12</w:t>
       </w:r>
     </w:p>
     <w:p>
@@ -77,51 +77,23 @@
     <w:p>
       <w:pPr/>
       <w:r>
-        <w:rPr>
-          <w:b/>
-        </w:rPr>
         <w:t>TAS2O_Complete_Package_AI_Enhanced/</w:t>
         <w:br/>
-      </w:r>
-      <w:r>
         <w:t xml:space="preserve">  00_Master_Index/</w:t>
         <w:br/>
-      </w:r>
-      <w:r>
         <w:t xml:space="preserve">  01_Course_Core/</w:t>
         <w:br/>
-      </w:r>
-      <w:r>
-        <w:t xml:space="preserve">  02_Curriculum_and_Planning/</w:t>
+        <w:t xml:space="preserve">  02_Assignments_and_Rubrics/</w:t>
         <w:br/>
-      </w:r>
-      <w:r>
-        <w:t xml:space="preserve">  03_Assignments_and_Rubrics/</w:t>
+        <w:t xml:space="preserve">  03_Safety_AI_and_Practical_Controls/</w:t>
         <w:br/>
-      </w:r>
-      <w:r>
-        <w:t xml:space="preserve">  04_Safety_and_AI_Integrity/</w:t>
+        <w:t xml:space="preserve">  04_Assessment_Attendance_and_Credit_Reporting/</w:t>
         <w:br/>
-      </w:r>
-      <w:r>
-        <w:t xml:space="preserve">  05_Assessment_Records_and_Credit_Reporting/</w:t>
+        <w:t xml:space="preserve">  05_School_Admin_and_Inspection/</w:t>
         <w:br/>
-      </w:r>
-      <w:r>
-        <w:t xml:space="preserve">  06_Student_Parent_and_Communication/</w:t>
+        <w:t xml:space="preserve">  06_Facilities_Technology_and_Budget/</w:t>
         <w:br/>
-      </w:r>
-      <w:r>
-        <w:t xml:space="preserve">  07_Facilities_Technology_and_Equipment/</w:t>
-        <w:br/>
-      </w:r>
-      <w:r>
-        <w:t xml:space="preserve">  08_Inspection_and_School_Admin/</w:t>
-        <w:br/>
-      </w:r>
-      <w:r>
-        <w:t xml:space="preserve">  09_Showcase_and_Exemplars/</w:t>
-        <w:br/>
+        <w:t xml:space="preserve">  07_Student_Communication_and_Showcase/</w:t>
       </w:r>
     </w:p>
     <w:p>
@@ -2192,7 +2164,7 @@
     </w:p>
     <w:p>
       <w:r>
-        <w:t>☐ Replace [Insert School Name], BSID, principal, teacher, school address, and dates.</w:t>
+        <w:t>☐ Replace Webtree Academy, BSID, principal, teacher, school address, and dates.</w:t>
       </w:r>
     </w:p>
     <w:p>

</xml_diff>

<commit_message>
update for more safety
</commit_message>
<xml_diff>
--- a/00_Master_Index/TAS2O_Complete_Package_Master_Index_AI_Enhanced.docx
+++ b/00_Master_Index/TAS2O_Complete_Package_Master_Index_AI_Enhanced.docx
@@ -2097,6 +2097,216 @@
           </w:p>
         </w:tc>
       </w:tr>
+      <w:tr>
+        <w:tc>
+          <w:tcPr>
+            <w:tcW w:type="dxa" w:w="2556"/>
+          </w:tcPr>
+          <w:p>
+            <w:r>
+              <w:t>30</w:t>
+            </w:r>
+          </w:p>
+        </w:tc>
+        <w:tc>
+          <w:tcPr>
+            <w:tcW w:type="dxa" w:w="2556"/>
+          </w:tcPr>
+          <w:p>
+            <w:r>
+              <w:t>Indigenous Content Course Outline Addendum</w:t>
+            </w:r>
+          </w:p>
+        </w:tc>
+        <w:tc>
+          <w:tcPr>
+            <w:tcW w:type="dxa" w:w="2556"/>
+          </w:tcPr>
+          <w:p>
+            <w:r>
+              <w:t>TAS2O_Indigenous_Content_Course_Outline_Addendum.docx</w:t>
+            </w:r>
+          </w:p>
+        </w:tc>
+        <w:tc>
+          <w:tcPr>
+            <w:tcW w:type="dxa" w:w="2556"/>
+          </w:tcPr>
+          <w:p>
+            <w:r>
+              <w:t>Indigenous curriculum integration for A1.7 / B1.3 / B1.4, with resource and evidence guidance.</w:t>
+            </w:r>
+          </w:p>
+        </w:tc>
+      </w:tr>
+      <w:tr>
+        <w:tc>
+          <w:tcPr>
+            <w:tcW w:type="dxa" w:w="2556"/>
+          </w:tcPr>
+          <w:p>
+            <w:r>
+              <w:t>31</w:t>
+            </w:r>
+          </w:p>
+        </w:tc>
+        <w:tc>
+          <w:tcPr>
+            <w:tcW w:type="dxa" w:w="2556"/>
+          </w:tcPr>
+          <w:p>
+            <w:r>
+              <w:t>Indigenous Innovation Lesson Plan</w:t>
+            </w:r>
+          </w:p>
+        </w:tc>
+        <w:tc>
+          <w:tcPr>
+            <w:tcW w:type="dxa" w:w="2556"/>
+          </w:tcPr>
+          <w:p>
+            <w:r>
+              <w:t>TAS2O_Indigenous_Innovation_Lesson_Plan.docx</w:t>
+            </w:r>
+          </w:p>
+        </w:tc>
+        <w:tc>
+          <w:tcPr>
+            <w:tcW w:type="dxa" w:w="2556"/>
+          </w:tcPr>
+          <w:p>
+            <w:r>
+              <w:t>75-minute lesson plan on Indigenous innovation examples and student reflection.</w:t>
+            </w:r>
+          </w:p>
+        </w:tc>
+      </w:tr>
+      <w:tr>
+        <w:tc>
+          <w:tcPr>
+            <w:tcW w:type="dxa" w:w="2556"/>
+          </w:tcPr>
+          <w:p>
+            <w:r>
+              <w:t>32</w:t>
+            </w:r>
+          </w:p>
+        </w:tc>
+        <w:tc>
+          <w:tcPr>
+            <w:tcW w:type="dxa" w:w="2556"/>
+          </w:tcPr>
+          <w:p>
+            <w:r>
+              <w:t>Project Plan Template with Indigenous Prompt</w:t>
+            </w:r>
+          </w:p>
+        </w:tc>
+        <w:tc>
+          <w:tcPr>
+            <w:tcW w:type="dxa" w:w="2556"/>
+          </w:tcPr>
+          <w:p>
+            <w:r>
+              <w:t>TAS2O_Project_Plan_Template_with_Indigenous_Prompt.docx</w:t>
+            </w:r>
+          </w:p>
+        </w:tc>
+        <w:tc>
+          <w:tcPr>
+            <w:tcW w:type="dxa" w:w="2556"/>
+          </w:tcPr>
+          <w:p>
+            <w:r>
+              <w:t>Student project planning template with Indigenous and diverse community prompt.</w:t>
+            </w:r>
+          </w:p>
+        </w:tc>
+      </w:tr>
+      <w:tr>
+        <w:tc>
+          <w:tcPr>
+            <w:tcW w:type="dxa" w:w="2556"/>
+          </w:tcPr>
+          <w:p>
+            <w:r>
+              <w:t>33</w:t>
+            </w:r>
+          </w:p>
+        </w:tc>
+        <w:tc>
+          <w:tcPr>
+            <w:tcW w:type="dxa" w:w="2556"/>
+          </w:tcPr>
+          <w:p>
+            <w:r>
+              <w:t>Observation Record Form</w:t>
+            </w:r>
+          </w:p>
+        </w:tc>
+        <w:tc>
+          <w:tcPr>
+            <w:tcW w:type="dxa" w:w="2556"/>
+          </w:tcPr>
+          <w:p>
+            <w:r>
+              <w:t>TAS2O_Observation_Record_Form.docx</w:t>
+            </w:r>
+          </w:p>
+        </w:tc>
+        <w:tc>
+          <w:tcPr>
+            <w:tcW w:type="dxa" w:w="2556"/>
+          </w:tcPr>
+          <w:p>
+            <w:r>
+              <w:t>Teacher observation form for live class evidence, including A4 safety observations.</w:t>
+            </w:r>
+          </w:p>
+        </w:tc>
+      </w:tr>
+      <w:tr>
+        <w:tc>
+          <w:tcPr>
+            <w:tcW w:type="dxa" w:w="2556"/>
+          </w:tcPr>
+          <w:p>
+            <w:r>
+              <w:t>34</w:t>
+            </w:r>
+          </w:p>
+        </w:tc>
+        <w:tc>
+          <w:tcPr>
+            <w:tcW w:type="dxa" w:w="2556"/>
+          </w:tcPr>
+          <w:p>
+            <w:r>
+              <w:t>Student Conference Record</w:t>
+            </w:r>
+          </w:p>
+        </w:tc>
+        <w:tc>
+          <w:tcPr>
+            <w:tcW w:type="dxa" w:w="2556"/>
+          </w:tcPr>
+          <w:p>
+            <w:r>
+              <w:t>TAS2O_Student_Conference_Record.docx</w:t>
+            </w:r>
+          </w:p>
+        </w:tc>
+        <w:tc>
+          <w:tcPr>
+            <w:tcW w:type="dxa" w:w="2556"/>
+          </w:tcPr>
+          <w:p>
+            <w:r>
+              <w:t>Student conversation record for POC assessment evidence and project conferencing.</w:t>
+            </w:r>
+          </w:p>
+        </w:tc>
+      </w:tr>
     </w:tbl>
     <w:p>
       <w:pPr>
@@ -2302,13 +2512,8 @@
             <w:tcW w:type="dxa" w:w="3408"/>
           </w:tcPr>
           <w:p>
-            <w:r/>
             <w:r>
-              <w:rPr>
-                <w:b w:val="0"/>
-                <w:sz w:val="18"/>
-              </w:rPr>
-              <w:t>01, 02, 03, 04, 12</w:t>
+              <w:t>01, 02, 03, 04, 12, 30, 31, 32, 33, 34</w:t>
             </w:r>
           </w:p>
         </w:tc>
@@ -2349,13 +2554,8 @@
             <w:tcW w:type="dxa" w:w="3408"/>
           </w:tcPr>
           <w:p>
-            <w:r/>
             <w:r>
-              <w:rPr>
-                <w:b w:val="0"/>
-                <w:sz w:val="18"/>
-              </w:rPr>
-              <w:t>05, 06, 09, 10, 15, 20</w:t>
+              <w:t>05, 06, 09, 10, 15, 20, 32, 33, 34</w:t>
             </w:r>
           </w:p>
         </w:tc>
@@ -2396,13 +2596,8 @@
             <w:tcW w:type="dxa" w:w="3408"/>
           </w:tcPr>
           <w:p>
-            <w:r/>
             <w:r>
-              <w:rPr>
-                <w:b w:val="0"/>
-                <w:sz w:val="18"/>
-              </w:rPr>
-              <w:t>07, 17, 18, 21, 24, 26</w:t>
+              <w:t>07, 17, 18, 21, 24, 26, 33</w:t>
             </w:r>
           </w:p>
         </w:tc>
@@ -2537,12 +2732,7 @@
             <w:tcW w:type="dxa" w:w="3408"/>
           </w:tcPr>
           <w:p>
-            <w:r/>
             <w:r>
-              <w:rPr>
-                <w:b w:val="0"/>
-                <w:sz w:val="18"/>
-              </w:rPr>
               <w:t>18, 19, 23, 29</w:t>
             </w:r>
           </w:p>

</xml_diff>